<commit_message>
docs: round 4 followup — Edit Services flow on Clients (HIGH)
User-flagged: clicking Edit next to "+ Add service" on a client
detail opens a separate "Edit Services" modal with one action per
row (Archive only). Our build doesn't open a modal — it transforms
the existing service list inline with up/down reorder arrows, red
X delete, and keeps status pills + progress bars visible.

Three real gaps:
- No way to reorder services on portal
- No way to delete (only archive)
- No way to rename inline

Updated Clients item #25 (was vague "Edit not deep-tested") to a
concrete HIGH finding with the inline-transform pattern as the fix.
Subtitle now mentions three HIGH flow gaps (Add client dead, Add
service reduced, Edit Services modal-not-inline).

Co-Authored-By: Claude Opus 4.7 <noreply@anthropic.com>
</commit_message>
<xml_diff>
--- a/docs/qa-comparison/clients-page-qa-round4-deep.docx
+++ b/docs/qa-comparison/clients-page-qa-round4-deep.docx
@@ -55,7 +55,7 @@
           <w:color w:val="5A5A5A"/>
           <w:sz w:val="24"/>
         </w:rPr>
-        <w:t>Round 4 deep audit. Replaces the earlier round 4 Clients doc (which was a click-through, not an audit). 28 distinct findings across the list view, the detail view, and the modals. Two HIGH wiring bugs surfaced fresh this round: Add client opens nothing despite firing, and the Add service modal is dramatically reduced vs ours (no Type selection, no Template, no Next deliverable date).</w:t>
+        <w:t>Round 4 deep audit. Replaces the earlier round 4 Clients doc (which was a click-through, not an audit). 28 distinct findings across the list view, the detail view, and the modals. Three HIGH wiring/flow gaps surfaced fresh this round: Add client opens nothing despite firing, Add service modal is dramatically reduced (no Type, no Template, no Next deliverable date), and Edit Services opens a stripped-down modal instead of transforming the list inline (no reorder, no delete, no rename — only Archive).</w:t>
       </w:r>
     </w:p>
     <w:p>
@@ -2779,7 +2779,7 @@
               <w:bottom w:val="nil"/>
               <w:right w:val="nil"/>
             </w:tcBorders>
-            <w:shd w:val="clear" w:color="auto" w:fill="D69D2A"/>
+            <w:shd w:val="clear" w:color="auto" w:fill="D33B3B"/>
             <w:vAlign w:val="center"/>
           </w:tcPr>
           <w:p>
@@ -2793,7 +2793,7 @@
                 <w:color w:val="FFFFFF"/>
                 <w:sz w:val="16"/>
               </w:rPr>
-              <w:t>MED</w:t>
+              <w:t>HIGH</w:t>
             </w:r>
           </w:p>
         </w:tc>
@@ -2845,7 +2845,7 @@
                 <w:color w:val="1A1A1A"/>
                 <w:sz w:val="22"/>
               </w:rPr>
-              <w:t>#25. Edit button on services not deep-tested</w:t>
+              <w:t>#25. Edit Services flow: modal overlay instead of inline transform, missing reorder + delete + rename</w:t>
             </w:r>
           </w:p>
         </w:tc>
@@ -2869,7 +2869,7 @@
           <w:color w:val="1A1A1A"/>
           <w:sz w:val="20"/>
         </w:rPr>
-        <w:t>Not flagged previously; surfaced in round 4.</w:t>
+        <w:t>Not flagged previously; user-flagged in round 4 follow-up.</w:t>
       </w:r>
     </w:p>
     <w:p>
@@ -2890,7 +2890,7 @@
           <w:color w:val="1A1A1A"/>
           <w:sz w:val="20"/>
         </w:rPr>
-        <w:t>The "Edit" button next to "+ Add service" is visible. Click behavior not deep-tested this pass; flagging for verification in the next round.</w:t>
+        <w:t>Click on "Edit" next to "+ Add service" opens a separate "Edit Services" modal listing each service with one action only — Archive. Our build doesn't open a modal at all: it transforms the existing service list inline, adding up/down reorder arrows on the left of each row, a red X delete on the right, and keeps Done + "+ Add service" visible at the top. Status pills (ON FIRE / ON TRACK) and progress bars remain visible during edit so the AM keeps context. Portal's flow strips that context and limits the AM to a single action (Archive). Three real gaps: (a) no way to reorder services, (b) no way to delete (only archive), (c) no way to rename inline.</w:t>
       </w:r>
     </w:p>
     <w:p>
@@ -2911,7 +2911,7 @@
           <w:color w:val="1A1A1A"/>
           <w:sz w:val="20"/>
         </w:rPr>
-        <w:t>Confirm Edit opens a panel/modal that lets the AM rename services, reassign templates, change due dates, archive individual services. Compare to our build's edit-service flow.</w:t>
+        <w:t>Match our build's inline-transform pattern instead of opening a modal. On Edit click, transform the existing service list: render up/down chevrons on the left of each row (reorder), red X on the right (delete with soft-delete to trash), keep status pills + progress bars visible, keep "+ Add service" + Done buttons at top. Click on a service name during edit mode opens an inline rename input. Archive can stay as one of the row-level actions (alongside delete) but shouldn't be the only option.</w:t>
       </w:r>
     </w:p>
     <w:p>
@@ -6571,7 +6571,7 @@
               <w:bottom w:val="nil"/>
               <w:right w:val="nil"/>
             </w:tcBorders>
-            <w:shd w:val="clear" w:color="auto" w:fill="D69D2A"/>
+            <w:shd w:val="clear" w:color="auto" w:fill="D33B3B"/>
             <w:vAlign w:val="top"/>
           </w:tcPr>
           <w:p>
@@ -6585,7 +6585,7 @@
                 <w:color w:val="FFFFFF"/>
                 <w:sz w:val="16"/>
               </w:rPr>
-              <w:t>MED</w:t>
+              <w:t>HIGH</w:t>
             </w:r>
           </w:p>
         </w:tc>
@@ -6610,7 +6610,7 @@
                 <w:color w:val="1A1A1A"/>
                 <w:sz w:val="21"/>
               </w:rPr>
-              <w:t>#25. Edit button on services not deep-tested</w:t>
+              <w:t>#25. Edit Services flow: modal overlay instead of inline transform, missing reorder + delete + rename</w:t>
             </w:r>
             <w:r>
               <w:br/>
@@ -6620,7 +6620,7 @@
                 <w:color w:val="1A1A1A"/>
                 <w:sz w:val="20"/>
               </w:rPr>
-              <w:t>Confirm Edit opens a panel/modal that lets the AM rename services, reassign templates, change due dates, archive individual services. Compare to our build's edit-service flow.</w:t>
+              <w:t>Match our build's inline-transform pattern instead of opening a modal. On Edit click, transform the existing service list: render up/down chevrons on the left of each row (reorder), red X on the right (delete with soft-delete to trash), keep status pills + progress bars visible, keep "+ Add service" + Done buttons at top. Click on a service name during edit mode opens an inline rename input. Archive can stay as one of the row-level actions (alongside delete) but shouldn't be the only option.</w:t>
             </w:r>
           </w:p>
         </w:tc>

</xml_diff>

<commit_message>
docs: remove Touchpoints tab item from Clients round 4 deep doc
Removed the "Touchpoints tab presence not verified" item (was #27).
Renumbered the trailing item from #28 to #27. Open count drops
from 14 to 13.

Co-Authored-By: Claude Opus 4.7 <noreply@anthropic.com>
</commit_message>
<xml_diff>
--- a/docs/qa-comparison/clients-page-qa-round4-deep.docx
+++ b/docs/qa-comparison/clients-page-qa-round4-deep.docx
@@ -69,7 +69,7 @@
           <w:color w:val="5A5A5A"/>
           <w:sz w:val="22"/>
         </w:rPr>
-        <w:t>Round 4 deep findings: 3 done · 14 open · 4 fyi</w:t>
+        <w:t>Round 4 deep findings: 3 done · 13 open · 4 fyi</w:t>
       </w:r>
     </w:p>
     <w:p>
@@ -3173,171 +3173,7 @@
                 <w:color w:val="1A1A1A"/>
                 <w:sz w:val="22"/>
               </w:rPr>
-              <w:t>#27. Touchpoints tab presence not verified</w:t>
-            </w:r>
-          </w:p>
-        </w:tc>
-      </w:tr>
-    </w:tbl>
-    <w:p>
-      <w:pPr>
-        <w:spacing w:after="60"/>
-        <w:ind w:left="230"/>
-      </w:pPr>
-      <w:r>
-        <w:rPr>
-          <w:b/>
-          <w:color w:val="1A1A1A"/>
-          <w:sz w:val="20"/>
-        </w:rPr>
-        <w:t xml:space="preserve">Where it stood: </w:t>
-      </w:r>
-      <w:r>
-        <w:rPr>
-          <w:color w:val="1A1A1A"/>
-          <w:sz w:val="20"/>
-        </w:rPr>
-        <w:t>Our build has a Touchpoints tab on each client; portal currently shows Overview / Onboarding / About / Stats / Notes (5 tabs), no Touchpoints.</w:t>
-      </w:r>
-    </w:p>
-    <w:p>
-      <w:pPr>
-        <w:spacing w:after="60"/>
-        <w:ind w:left="230"/>
-      </w:pPr>
-      <w:r>
-        <w:rPr>
-          <w:b/>
-          <w:color w:val="1A1A1A"/>
-          <w:sz w:val="20"/>
-        </w:rPr>
-        <w:t xml:space="preserve">Round 4 status: </w:t>
-      </w:r>
-      <w:r>
-        <w:rPr>
-          <w:color w:val="1A1A1A"/>
-          <w:sz w:val="20"/>
-        </w:rPr>
-        <w:t>Touchpoints (the call/email/meeting log) is missing from the portal's client detail tabs.</w:t>
-      </w:r>
-    </w:p>
-    <w:p>
-      <w:pPr>
-        <w:spacing w:after="60"/>
-        <w:ind w:left="230"/>
-      </w:pPr>
-      <w:r>
-        <w:rPr>
-          <w:b/>
-          <w:color w:val="1A1A1A"/>
-          <w:sz w:val="20"/>
-        </w:rPr>
-        <w:t xml:space="preserve">What's left: </w:t>
-      </w:r>
-      <w:r>
-        <w:rPr>
-          <w:color w:val="1A1A1A"/>
-          <w:sz w:val="20"/>
-        </w:rPr>
-        <w:t>Confirm whether Touchpoints is in scope for portal v1. If yes, add the tab. If no, document the deferral so AMs aren't surprised when they migrate.</w:t>
-      </w:r>
-    </w:p>
-    <w:p>
-      <w:pPr>
-        <w:spacing w:after="40"/>
-      </w:pPr>
-    </w:p>
-    <w:tbl>
-      <w:tblPr>
-        <w:tblW w:type="auto" w:w="0"/>
-        <w:tblLayout w:type="fixed"/>
-        <w:tblLook w:firstColumn="1" w:firstRow="1" w:lastColumn="0" w:lastRow="0" w:noHBand="0" w:noVBand="1" w:val="04A0"/>
-      </w:tblPr>
-      <w:tblGrid>
-        <w:gridCol w:w="792"/>
-        <w:gridCol w:w="1368"/>
-        <w:gridCol w:w="7920"/>
-      </w:tblGrid>
-      <w:tr>
-        <w:trPr>
-          <w:trHeight w:val="312"/>
-        </w:trPr>
-        <w:tc>
-          <w:tcPr>
-            <w:tcW w:type="dxa" w:w="792"/>
-            <w:tcBorders>
-              <w:top w:val="nil"/>
-              <w:left w:val="nil"/>
-              <w:bottom w:val="nil"/>
-              <w:right w:val="nil"/>
-            </w:tcBorders>
-            <w:shd w:val="clear" w:color="auto" w:fill="D69D2A"/>
-            <w:vAlign w:val="center"/>
-          </w:tcPr>
-          <w:p>
-            <w:pPr>
-              <w:spacing w:after="0"/>
-              <w:jc w:val="center"/>
-            </w:pPr>
-            <w:r>
-              <w:rPr>
-                <w:b/>
-                <w:color w:val="FFFFFF"/>
-                <w:sz w:val="16"/>
-              </w:rPr>
-              <w:t>MED</w:t>
-            </w:r>
-          </w:p>
-        </w:tc>
-        <w:tc>
-          <w:tcPr>
-            <w:tcW w:type="dxa" w:w="1368"/>
-            <w:tcBorders>
-              <w:top w:val="nil"/>
-              <w:left w:val="nil"/>
-              <w:bottom w:val="nil"/>
-              <w:right w:val="nil"/>
-            </w:tcBorders>
-            <w:shd w:val="clear" w:color="auto" w:fill="D33B3B"/>
-            <w:vAlign w:val="center"/>
-          </w:tcPr>
-          <w:p>
-            <w:pPr>
-              <w:spacing w:after="0"/>
-              <w:jc w:val="center"/>
-            </w:pPr>
-            <w:r>
-              <w:rPr>
-                <w:b/>
-                <w:color w:val="FFFFFF"/>
-                <w:sz w:val="16"/>
-              </w:rPr>
-              <w:t>OPEN</w:t>
-            </w:r>
-          </w:p>
-        </w:tc>
-        <w:tc>
-          <w:tcPr>
-            <w:tcW w:type="dxa" w:w="7920"/>
-            <w:tcBorders>
-              <w:top w:val="nil"/>
-              <w:left w:val="nil"/>
-              <w:bottom w:val="nil"/>
-              <w:right w:val="nil"/>
-            </w:tcBorders>
-            <w:vAlign w:val="center"/>
-          </w:tcPr>
-          <w:p>
-            <w:pPr>
-              <w:spacing w:after="0"/>
-            </w:pPr>
-            <w:r>
-              <w:rPr>
-                <w:b/>
-                <w:color w:val="1A1A1A"/>
-                <w:sz w:val="22"/>
-              </w:rPr>
-              <w:t>#28. Quick Links panel on About tab — no per-link actions</w:t>
+              <w:t>#27. Quick Links panel on About tab — no per-link actions</w:t>
             </w:r>
           </w:p>
         </w:tc>
@@ -6842,123 +6678,7 @@
                 <w:color w:val="1A1A1A"/>
                 <w:sz w:val="21"/>
               </w:rPr>
-              <w:t>#27. Touchpoints tab presence not verified</w:t>
-            </w:r>
-            <w:r>
-              <w:br/>
-            </w:r>
-            <w:r>
-              <w:rPr>
-                <w:color w:val="1A1A1A"/>
-                <w:sz w:val="20"/>
-              </w:rPr>
-              <w:t>Confirm whether Touchpoints is in scope for portal v1. If yes, add the tab. If no, document the deferral so AMs aren't surprised when they migrate.</w:t>
-            </w:r>
-          </w:p>
-        </w:tc>
-      </w:tr>
-    </w:tbl>
-    <w:p>
-      <w:pPr>
-        <w:spacing w:after="80"/>
-      </w:pPr>
-    </w:p>
-    <w:tbl>
-      <w:tblPr>
-        <w:tblW w:type="auto" w:w="0"/>
-        <w:tblLayout w:type="fixed"/>
-        <w:tblLook w:firstColumn="1" w:firstRow="1" w:lastColumn="0" w:lastRow="0" w:noHBand="0" w:noVBand="1" w:val="04A0"/>
-      </w:tblPr>
-      <w:tblGrid>
-        <w:gridCol w:w="461"/>
-        <w:gridCol w:w="792"/>
-        <w:gridCol w:w="8539"/>
-      </w:tblGrid>
-      <w:tr>
-        <w:tc>
-          <w:tcPr>
-            <w:tcW w:type="dxa" w:w="461"/>
-            <w:tcBorders>
-              <w:top w:val="nil"/>
-              <w:left w:val="nil"/>
-              <w:bottom w:val="nil"/>
-              <w:right w:val="nil"/>
-            </w:tcBorders>
-            <w:vAlign w:val="top"/>
-          </w:tcPr>
-          <w:p>
-            <w:pPr>
-              <w:spacing w:after="0"/>
-            </w:pPr>
-            <w:sdt>
-              <w:sdtPr>
-                <w14:checkbox>
-                  <w14:checked w14:val="0"/>
-                  <w14:checkedState w14:val="2612" w14:font="MS Gothic"/>
-                  <w14:uncheckedState w14:val="2610" w14:font="MS Gothic"/>
-                </w14:checkbox>
-              </w:sdtPr>
-              <w:sdtContent>
-                <w:r>
-                  <w:rPr>
-                    <w:rFonts w:ascii="MS Gothic" w:hAnsi="MS Gothic" w:eastAsia="MS Gothic"/>
-                    <w:sz w:val="24"/>
-                  </w:rPr>
-                  <w:t>☐</w:t>
-                </w:r>
-              </w:sdtContent>
-            </w:sdt>
-          </w:p>
-        </w:tc>
-        <w:tc>
-          <w:tcPr>
-            <w:tcW w:type="dxa" w:w="792"/>
-            <w:tcBorders>
-              <w:top w:val="nil"/>
-              <w:left w:val="nil"/>
-              <w:bottom w:val="nil"/>
-              <w:right w:val="nil"/>
-            </w:tcBorders>
-            <w:shd w:val="clear" w:color="auto" w:fill="D69D2A"/>
-            <w:vAlign w:val="top"/>
-          </w:tcPr>
-          <w:p>
-            <w:pPr>
-              <w:spacing w:after="0"/>
-              <w:jc w:val="center"/>
-            </w:pPr>
-            <w:r>
-              <w:rPr>
-                <w:b/>
-                <w:color w:val="FFFFFF"/>
-                <w:sz w:val="16"/>
-              </w:rPr>
-              <w:t>MED</w:t>
-            </w:r>
-          </w:p>
-        </w:tc>
-        <w:tc>
-          <w:tcPr>
-            <w:tcW w:type="dxa" w:w="8539"/>
-            <w:tcBorders>
-              <w:top w:val="nil"/>
-              <w:left w:val="nil"/>
-              <w:bottom w:val="nil"/>
-              <w:right w:val="nil"/>
-            </w:tcBorders>
-            <w:vAlign w:val="top"/>
-          </w:tcPr>
-          <w:p>
-            <w:pPr>
-              <w:spacing w:after="0"/>
-            </w:pPr>
-            <w:r>
-              <w:rPr>
-                <w:b/>
-                <w:color w:val="1A1A1A"/>
-                <w:sz w:val="21"/>
-              </w:rPr>
-              <w:t>#28. Quick Links panel on About tab — no per-link actions</w:t>
+              <w:t>#27. Quick Links panel on About tab — no per-link actions</w:t>
             </w:r>
             <w:r>
               <w:br/>

</xml_diff>

<commit_message>
docs: add #28 to Clients QA — remove Details panel (CRM Stage + Status)
User-flagged: portal renders a "Details" panel on the client detail
with CRM Stage + Status fields (both currently lowercase "active").
Our build doesn't have this panel. Status is already shown as a pill
in the client detail header; CRM-stage data isn't part of the
reference design.

Added as Clients #28 [MED] OPEN with the request to remove the panel
from the client detail page. If CRM Stage is needed for sales-team
visibility, it should live in a different context (admin-only
sidebar, export, separate view).

Open count goes from 13 to 14.

Co-Authored-By: Claude Opus 4.7 <noreply@anthropic.com>
</commit_message>
<xml_diff>
--- a/docs/qa-comparison/clients-page-qa-round4-deep.docx
+++ b/docs/qa-comparison/clients-page-qa-round4-deep.docx
@@ -69,7 +69,7 @@
           <w:color w:val="5A5A5A"/>
           <w:sz w:val="22"/>
         </w:rPr>
-        <w:t>Round 4 deep findings: 3 done · 13 open · 4 fyi</w:t>
+        <w:t>Round 4 deep findings: 3 done · 14 open · 4 fyi</w:t>
       </w:r>
     </w:p>
     <w:p>
@@ -3240,6 +3240,170 @@
           <w:sz w:val="20"/>
         </w:rPr>
         <w:t>Add a saved link to the portal and confirm it can be edited and deleted with the right label/url fields.</w:t>
+      </w:r>
+    </w:p>
+    <w:p>
+      <w:pPr>
+        <w:spacing w:after="40"/>
+      </w:pPr>
+    </w:p>
+    <w:tbl>
+      <w:tblPr>
+        <w:tblW w:type="auto" w:w="0"/>
+        <w:tblLayout w:type="fixed"/>
+        <w:tblLook w:firstColumn="1" w:firstRow="1" w:lastColumn="0" w:lastRow="0" w:noHBand="0" w:noVBand="1" w:val="04A0"/>
+      </w:tblPr>
+      <w:tblGrid>
+        <w:gridCol w:w="792"/>
+        <w:gridCol w:w="1368"/>
+        <w:gridCol w:w="7920"/>
+      </w:tblGrid>
+      <w:tr>
+        <w:trPr>
+          <w:trHeight w:val="312"/>
+        </w:trPr>
+        <w:tc>
+          <w:tcPr>
+            <w:tcW w:type="dxa" w:w="792"/>
+            <w:tcBorders>
+              <w:top w:val="nil"/>
+              <w:left w:val="nil"/>
+              <w:bottom w:val="nil"/>
+              <w:right w:val="nil"/>
+            </w:tcBorders>
+            <w:shd w:val="clear" w:color="auto" w:fill="D69D2A"/>
+            <w:vAlign w:val="center"/>
+          </w:tcPr>
+          <w:p>
+            <w:pPr>
+              <w:spacing w:after="0"/>
+              <w:jc w:val="center"/>
+            </w:pPr>
+            <w:r>
+              <w:rPr>
+                <w:b/>
+                <w:color w:val="FFFFFF"/>
+                <w:sz w:val="16"/>
+              </w:rPr>
+              <w:t>MED</w:t>
+            </w:r>
+          </w:p>
+        </w:tc>
+        <w:tc>
+          <w:tcPr>
+            <w:tcW w:type="dxa" w:w="1368"/>
+            <w:tcBorders>
+              <w:top w:val="nil"/>
+              <w:left w:val="nil"/>
+              <w:bottom w:val="nil"/>
+              <w:right w:val="nil"/>
+            </w:tcBorders>
+            <w:shd w:val="clear" w:color="auto" w:fill="D33B3B"/>
+            <w:vAlign w:val="center"/>
+          </w:tcPr>
+          <w:p>
+            <w:pPr>
+              <w:spacing w:after="0"/>
+              <w:jc w:val="center"/>
+            </w:pPr>
+            <w:r>
+              <w:rPr>
+                <w:b/>
+                <w:color w:val="FFFFFF"/>
+                <w:sz w:val="16"/>
+              </w:rPr>
+              <w:t>OPEN</w:t>
+            </w:r>
+          </w:p>
+        </w:tc>
+        <w:tc>
+          <w:tcPr>
+            <w:tcW w:type="dxa" w:w="7920"/>
+            <w:tcBorders>
+              <w:top w:val="nil"/>
+              <w:left w:val="nil"/>
+              <w:bottom w:val="nil"/>
+              <w:right w:val="nil"/>
+            </w:tcBorders>
+            <w:vAlign w:val="center"/>
+          </w:tcPr>
+          <w:p>
+            <w:pPr>
+              <w:spacing w:after="0"/>
+            </w:pPr>
+            <w:r>
+              <w:rPr>
+                <w:b/>
+                <w:color w:val="1A1A1A"/>
+                <w:sz w:val="22"/>
+              </w:rPr>
+              <w:t>#28. Remove the "Details" panel (CRM Stage + Status) from client detail</w:t>
+            </w:r>
+          </w:p>
+        </w:tc>
+      </w:tr>
+    </w:tbl>
+    <w:p>
+      <w:pPr>
+        <w:spacing w:after="60"/>
+        <w:ind w:left="230"/>
+      </w:pPr>
+      <w:r>
+        <w:rPr>
+          <w:b/>
+          <w:color w:val="1A1A1A"/>
+          <w:sz w:val="20"/>
+        </w:rPr>
+        <w:t xml:space="preserve">Where it stood: </w:t>
+      </w:r>
+      <w:r>
+        <w:rPr>
+          <w:color w:val="1A1A1A"/>
+          <w:sz w:val="20"/>
+        </w:rPr>
+        <w:t>Not flagged previously; user-flagged in round 4 follow-up.</w:t>
+      </w:r>
+    </w:p>
+    <w:p>
+      <w:pPr>
+        <w:spacing w:after="60"/>
+        <w:ind w:left="230"/>
+      </w:pPr>
+      <w:r>
+        <w:rPr>
+          <w:b/>
+          <w:color w:val="1A1A1A"/>
+          <w:sz w:val="20"/>
+        </w:rPr>
+        <w:t xml:space="preserve">Round 4 status: </w:t>
+      </w:r>
+      <w:r>
+        <w:rPr>
+          <w:color w:val="1A1A1A"/>
+          <w:sz w:val="20"/>
+        </w:rPr>
+        <w:t>Portal renders a "Details" panel on the client detail page with two fields: CRM Stage and Status (both currently rendering as lowercase "active"). Our build doesn't have this panel. Status is already shown as a pill in the client detail header ("STATUS · ON FIRE"), and we don't surface CRM-synced fields anywhere on the operator-facing client detail. The Details panel duplicates the status field and adds CRM-stage data that isn't part of the reference design. Lowercase value rendering also breaks house style for status displays.</w:t>
+      </w:r>
+    </w:p>
+    <w:p>
+      <w:pPr>
+        <w:spacing w:after="60"/>
+        <w:ind w:left="230"/>
+      </w:pPr>
+      <w:r>
+        <w:rPr>
+          <w:b/>
+          <w:color w:val="1A1A1A"/>
+          <w:sz w:val="20"/>
+        </w:rPr>
+        <w:t xml:space="preserve">What's left: </w:t>
+      </w:r>
+      <w:r>
+        <w:rPr>
+          <w:color w:val="1A1A1A"/>
+          <w:sz w:val="20"/>
+        </w:rPr>
+        <w:t>Remove the Details panel from the client detail page. The Status pill in the header already covers operational state. If CRM Stage is needed for sales-team visibility, surface it in a different context (e.g., a CRM-only view, an admin-only sidebar, or an export) rather than the operator-facing client detail.</w:t>
       </w:r>
     </w:p>
     <w:p>
@@ -6699,6 +6863,122 @@
         <w:spacing w:after="80"/>
       </w:pPr>
     </w:p>
+    <w:tbl>
+      <w:tblPr>
+        <w:tblW w:type="auto" w:w="0"/>
+        <w:tblLayout w:type="fixed"/>
+        <w:tblLook w:firstColumn="1" w:firstRow="1" w:lastColumn="0" w:lastRow="0" w:noHBand="0" w:noVBand="1" w:val="04A0"/>
+      </w:tblPr>
+      <w:tblGrid>
+        <w:gridCol w:w="461"/>
+        <w:gridCol w:w="792"/>
+        <w:gridCol w:w="8539"/>
+      </w:tblGrid>
+      <w:tr>
+        <w:tc>
+          <w:tcPr>
+            <w:tcW w:type="dxa" w:w="461"/>
+            <w:tcBorders>
+              <w:top w:val="nil"/>
+              <w:left w:val="nil"/>
+              <w:bottom w:val="nil"/>
+              <w:right w:val="nil"/>
+            </w:tcBorders>
+            <w:vAlign w:val="top"/>
+          </w:tcPr>
+          <w:p>
+            <w:pPr>
+              <w:spacing w:after="0"/>
+            </w:pPr>
+            <w:sdt>
+              <w:sdtPr>
+                <w14:checkbox>
+                  <w14:checked w14:val="0"/>
+                  <w14:checkedState w14:val="2612" w14:font="MS Gothic"/>
+                  <w14:uncheckedState w14:val="2610" w14:font="MS Gothic"/>
+                </w14:checkbox>
+              </w:sdtPr>
+              <w:sdtContent>
+                <w:r>
+                  <w:rPr>
+                    <w:rFonts w:ascii="MS Gothic" w:hAnsi="MS Gothic" w:eastAsia="MS Gothic"/>
+                    <w:sz w:val="24"/>
+                  </w:rPr>
+                  <w:t>☐</w:t>
+                </w:r>
+              </w:sdtContent>
+            </w:sdt>
+          </w:p>
+        </w:tc>
+        <w:tc>
+          <w:tcPr>
+            <w:tcW w:type="dxa" w:w="792"/>
+            <w:tcBorders>
+              <w:top w:val="nil"/>
+              <w:left w:val="nil"/>
+              <w:bottom w:val="nil"/>
+              <w:right w:val="nil"/>
+            </w:tcBorders>
+            <w:shd w:val="clear" w:color="auto" w:fill="D69D2A"/>
+            <w:vAlign w:val="top"/>
+          </w:tcPr>
+          <w:p>
+            <w:pPr>
+              <w:spacing w:after="0"/>
+              <w:jc w:val="center"/>
+            </w:pPr>
+            <w:r>
+              <w:rPr>
+                <w:b/>
+                <w:color w:val="FFFFFF"/>
+                <w:sz w:val="16"/>
+              </w:rPr>
+              <w:t>MED</w:t>
+            </w:r>
+          </w:p>
+        </w:tc>
+        <w:tc>
+          <w:tcPr>
+            <w:tcW w:type="dxa" w:w="8539"/>
+            <w:tcBorders>
+              <w:top w:val="nil"/>
+              <w:left w:val="nil"/>
+              <w:bottom w:val="nil"/>
+              <w:right w:val="nil"/>
+            </w:tcBorders>
+            <w:vAlign w:val="top"/>
+          </w:tcPr>
+          <w:p>
+            <w:pPr>
+              <w:spacing w:after="0"/>
+            </w:pPr>
+            <w:r>
+              <w:rPr>
+                <w:b/>
+                <w:color w:val="1A1A1A"/>
+                <w:sz w:val="21"/>
+              </w:rPr>
+              <w:t>#28. Remove the "Details" panel (CRM Stage + Status) from client detail</w:t>
+            </w:r>
+            <w:r>
+              <w:br/>
+            </w:r>
+            <w:r>
+              <w:rPr>
+                <w:color w:val="1A1A1A"/>
+                <w:sz w:val="20"/>
+              </w:rPr>
+              <w:t>Remove the Details panel from the client detail page. The Status pill in the header already covers operational state. If CRM Stage is needed for sales-team visibility, surface it in a different context (e.g., a CRM-only view, an admin-only sidebar, or an export) rather than the operator-facing client detail.</w:t>
+            </w:r>
+          </w:p>
+        </w:tc>
+      </w:tr>
+    </w:tbl>
+    <w:p>
+      <w:pPr>
+        <w:spacing w:after="80"/>
+      </w:pPr>
+    </w:p>
     <w:sectPr>
       <w:pgSz w:w="12240" w:h="15840"/>
       <w:pgMar w:top="1224" w:right="1080" w:bottom="1080" w:left="1080" w:header="720" w:footer="720" w:gutter="0"/>

</xml_diff>